<commit_message>
Final Report w/ correct GitHub
</commit_message>
<xml_diff>
--- a/documentation/Kajdasz_Final_Project_report.docx
+++ b/documentation/Kajdasz_Final_Project_report.docx
@@ -2966,7 +2966,21 @@
           <w:rFonts w:ascii="Calibri" w:hAnsi="Calibri"/>
           <w:color w:val="00467F"/>
         </w:rPr>
-        <w:t>https://github.com/jkajdasz/ach-geopolitical-forecasting-agent</w:t>
+        <w:t>https://github.com/j</w:t>
+      </w:r>
+      <w:r>
+        <w:rPr>
+          <w:rFonts w:ascii="Calibri" w:hAnsi="Calibri"/>
+          <w:color w:val="00467F"/>
+        </w:rPr>
+        <w:t>imkaj</w:t>
+      </w:r>
+      <w:r>
+        <w:rPr>
+          <w:rFonts w:ascii="Calibri" w:hAnsi="Calibri"/>
+          <w:color w:val="00467F"/>
+        </w:rPr>
+        <w:t>/ach-geopolitical-forecasting-agent</w:t>
       </w:r>
     </w:p>
     <w:p>

</xml_diff>